<commit_message>
docs(archive): refresh i-JMR submission snapshot with final files
Update ARCHIVED/20260615_IJMR-Submission to the current CI-built state:
TOC removed (paper.md/metadata.yaml/build_paper.sh + regenerated
paper.{docx,pdf,html,tex} and multimedia appendix), plus the Zenodo
metadata fix (.zenodo.json auto-derives version; CITATION.cff synced).
These are the files that will be submitted. Verified the archived DOCX
opens at the Abstract with no Table of Contents heading and retains all
94 bracket citations.

Co-Authored-By: Claude Fable 5 <noreply@anthropic.com>
</commit_message>
<xml_diff>
--- a/ARCHIVED/20260615_IJMR-Submission/multimedia_appendix_1.docx
+++ b/ARCHIVED/20260615_IJMR-Submission/multimedia_appendix_1.docx
@@ -26,32 +26,6 @@
         <w:t xml:space="preserve">June 2026</w:t>
       </w:r>
     </w:p>
-    <w:sdt>
-      <w:sdtPr>
-        <w:docPartObj>
-          <w:docPartGallery w:val="Table of Contents"/>
-          <w:docPartUnique/>
-        </w:docPartObj>
-      </w:sdtPr>
-      <w:sdtContent>
-        <w:p>
-          <w:pPr>
-            <w:pStyle w:val="TOCHeading"/>
-          </w:pPr>
-          <w:r>
-            <w:t xml:space="preserve">Table of Contents</w:t>
-          </w:r>
-        </w:p>
-        <w:p>
-          <w:r>
-            <w:fldChar w:fldCharType="begin" w:dirty="true"/>
-            <w:instrText xml:space="preserve">TOC \o "1-3" \h \z \u</w:instrText>
-            <w:fldChar w:fldCharType="separate"/>
-            <w:fldChar w:fldCharType="end"/>
-          </w:r>
-        </w:p>
-      </w:sdtContent>
-    </w:sdt>
     <w:bookmarkStart w:id="16" w:name="multimedia-appendix-1"/>
     <w:p>
       <w:pPr>

</xml_diff>